<commit_message>
creating credits for extensão
</commit_message>
<xml_diff>
--- a/src/main/resources/tabela_ementario.docx
+++ b/src/main/resources/tabela_ementario.docx
@@ -4,7 +4,7 @@
   <w:body>
     <w:tbl>
       <w:tblPr>
-        <w:tblW w:w="9045" w:type="dxa"/>
+        <w:tblW w:w="8640" w:type="dxa"/>
         <w:jc w:val="left"/>
         <w:tblInd w:w="52" w:type="dxa"/>
         <w:tblLayout w:type="fixed"/>
@@ -16,8 +16,8 @@
         </w:tblCellMar>
       </w:tblPr>
       <w:tblGrid>
-        <w:gridCol w:w="7483"/>
-        <w:gridCol w:w="1562"/>
+        <w:gridCol w:w="7005"/>
+        <w:gridCol w:w="1635"/>
       </w:tblGrid>
       <w:tr>
         <w:trPr>
@@ -25,7 +25,7 @@
         </w:trPr>
         <w:tc>
           <w:tcPr>
-            <w:tcW w:w="7483" w:type="dxa"/>
+            <w:tcW w:w="7005" w:type="dxa"/>
             <w:tcBorders>
               <w:top w:val="single" w:sz="2" w:space="0" w:color="000000"/>
               <w:left w:val="single" w:sz="2" w:space="0" w:color="000000"/>
@@ -34,8 +34,7 @@
           </w:tcPr>
           <w:p>
             <w:pPr>
-              <w:pStyle w:val="TableContents"/>
-              <w:bidi w:val="0"/>
+              <w:pStyle w:val="TableHeading"/>
               <w:jc w:val="left"/>
               <w:rPr>
                 <w:rFonts w:ascii="Times New Roman" w:hAnsi="Times New Roman"/>
@@ -46,6 +45,30 @@
               </w:rPr>
             </w:pPr>
             <w:r>
+              <w:rPr>
+                <w:rFonts w:ascii="Times New Roman" w:hAnsi="Times New Roman"/>
+                <w:b w:val="false"/>
+                <w:bCs w:val="false"/>
+                <w:sz w:val="24"/>
+                <w:szCs w:val="24"/>
+              </w:rPr>
+            </w:r>
+          </w:p>
+        </w:tc>
+        <w:tc>
+          <w:tcPr>
+            <w:tcW w:w="1635" w:type="dxa"/>
+            <w:tcBorders>
+              <w:top w:val="single" w:sz="2" w:space="0" w:color="000000"/>
+              <w:left w:val="single" w:sz="2" w:space="0" w:color="000000"/>
+              <w:bottom w:val="single" w:sz="2" w:space="0" w:color="000000"/>
+              <w:right w:val="single" w:sz="2" w:space="0" w:color="000000"/>
+            </w:tcBorders>
+          </w:tcPr>
+          <w:p>
+            <w:pPr>
+              <w:pStyle w:val="TableHeading"/>
+              <w:jc w:val="left"/>
               <w:rPr>
                 <w:rFonts w:ascii="Times New Roman" w:hAnsi="Times New Roman"/>
                 <w:b/>
@@ -53,42 +76,6 @@
                 <w:sz w:val="24"/>
                 <w:szCs w:val="24"/>
               </w:rPr>
-              <w:t>Componente Curricular:</w:t>
-            </w:r>
-            <w:r>
-              <w:rPr>
-                <w:rFonts w:ascii="Times New Roman" w:hAnsi="Times New Roman"/>
-                <w:b w:val="false"/>
-                <w:bCs w:val="false"/>
-                <w:sz w:val="24"/>
-                <w:szCs w:val="24"/>
-              </w:rPr>
-              <w:t xml:space="preserve"> </w:t>
-            </w:r>
-          </w:p>
-        </w:tc>
-        <w:tc>
-          <w:tcPr>
-            <w:tcW w:w="1562" w:type="dxa"/>
-            <w:tcBorders>
-              <w:top w:val="single" w:sz="2" w:space="0" w:color="000000"/>
-              <w:left w:val="single" w:sz="2" w:space="0" w:color="000000"/>
-              <w:bottom w:val="single" w:sz="2" w:space="0" w:color="000000"/>
-              <w:right w:val="single" w:sz="2" w:space="0" w:color="000000"/>
-            </w:tcBorders>
-          </w:tcPr>
-          <w:p>
-            <w:pPr>
-              <w:pStyle w:val="TableContents"/>
-              <w:bidi w:val="0"/>
-              <w:jc w:val="left"/>
-              <w:rPr>
-                <w:rFonts w:ascii="Times New Roman" w:hAnsi="Times New Roman"/>
-                <w:b w:val="false"/>
-                <w:bCs w:val="false"/>
-                <w:sz w:val="24"/>
-                <w:szCs w:val="24"/>
-              </w:rPr>
             </w:pPr>
             <w:r>
               <w:rPr>
@@ -98,9 +85,26 @@
                 <w:sz w:val="24"/>
                 <w:szCs w:val="24"/>
               </w:rPr>
-              <w:t>Créditos:</w:t>
-            </w:r>
-            <w:r>
+            </w:r>
+          </w:p>
+        </w:tc>
+      </w:tr>
+      <w:tr>
+        <w:trPr>
+          <w:trHeight w:val="509" w:hRule="atLeast"/>
+        </w:trPr>
+        <w:tc>
+          <w:tcPr>
+            <w:tcW w:w="7005" w:type="dxa"/>
+            <w:tcBorders>
+              <w:left w:val="single" w:sz="2" w:space="0" w:color="000000"/>
+              <w:bottom w:val="single" w:sz="2" w:space="0" w:color="000000"/>
+            </w:tcBorders>
+          </w:tcPr>
+          <w:p>
+            <w:pPr>
+              <w:pStyle w:val="TableHeading"/>
+              <w:jc w:val="left"/>
               <w:rPr>
                 <w:rFonts w:ascii="Times New Roman" w:hAnsi="Times New Roman"/>
                 <w:b w:val="false"/>
@@ -108,7 +112,41 @@
                 <w:sz w:val="24"/>
                 <w:szCs w:val="24"/>
               </w:rPr>
-              <w:t xml:space="preserve"> </w:t>
+            </w:pPr>
+            <w:r>
+              <w:rPr>
+                <w:rFonts w:ascii="Times New Roman" w:hAnsi="Times New Roman"/>
+                <w:b w:val="false"/>
+                <w:bCs w:val="false"/>
+                <w:sz w:val="24"/>
+                <w:szCs w:val="24"/>
+              </w:rPr>
+            </w:r>
+          </w:p>
+        </w:tc>
+        <w:tc>
+          <w:tcPr>
+            <w:tcW w:w="1635" w:type="dxa"/>
+            <w:tcBorders>
+              <w:left w:val="single" w:sz="2" w:space="0" w:color="000000"/>
+              <w:bottom w:val="single" w:sz="2" w:space="0" w:color="000000"/>
+              <w:right w:val="single" w:sz="2" w:space="0" w:color="000000"/>
+            </w:tcBorders>
+          </w:tcPr>
+          <w:p>
+            <w:pPr>
+              <w:pStyle w:val="TableHeading"/>
+              <w:jc w:val="left"/>
+              <w:rPr>
+                <w:sz w:val="24"/>
+                <w:szCs w:val="24"/>
+              </w:rPr>
+            </w:pPr>
+            <w:r>
+              <w:rPr>
+                <w:sz w:val="24"/>
+                <w:szCs w:val="24"/>
+              </w:rPr>
             </w:r>
           </w:p>
         </w:tc>
@@ -119,112 +157,12 @@
         </w:trPr>
         <w:tc>
           <w:tcPr>
-            <w:tcW w:w="7483" w:type="dxa"/>
-            <w:tcBorders>
-              <w:left w:val="single" w:sz="2" w:space="0" w:color="000000"/>
-              <w:bottom w:val="single" w:sz="2" w:space="0" w:color="000000"/>
-            </w:tcBorders>
-          </w:tcPr>
-          <w:p>
-            <w:pPr>
-              <w:pStyle w:val="TableContents"/>
-              <w:bidi w:val="0"/>
-              <w:jc w:val="left"/>
-              <w:rPr>
-                <w:rFonts w:ascii="Times New Roman" w:hAnsi="Times New Roman"/>
-                <w:b w:val="false"/>
-                <w:bCs w:val="false"/>
-                <w:sz w:val="24"/>
-                <w:szCs w:val="24"/>
-              </w:rPr>
-            </w:pPr>
-            <w:r>
-              <w:rPr>
-                <w:rFonts w:ascii="Times New Roman" w:hAnsi="Times New Roman"/>
-                <w:b/>
-                <w:bCs/>
-                <w:sz w:val="24"/>
-                <w:szCs w:val="24"/>
-              </w:rPr>
-              <w:t>Carga horária:</w:t>
-            </w:r>
-            <w:r>
-              <w:rPr>
-                <w:rFonts w:ascii="Times New Roman" w:hAnsi="Times New Roman"/>
-                <w:b w:val="false"/>
-                <w:bCs w:val="false"/>
-                <w:sz w:val="24"/>
-                <w:szCs w:val="24"/>
-              </w:rPr>
-              <w:t xml:space="preserve"> </w:t>
-            </w:r>
-          </w:p>
-        </w:tc>
-        <w:tc>
-          <w:tcPr>
-            <w:tcW w:w="1562" w:type="dxa"/>
+            <w:tcW w:w="8640" w:type="dxa"/>
+            <w:gridSpan w:val="2"/>
             <w:tcBorders>
               <w:left w:val="single" w:sz="2" w:space="0" w:color="000000"/>
               <w:bottom w:val="single" w:sz="2" w:space="0" w:color="000000"/>
               <w:right w:val="single" w:sz="2" w:space="0" w:color="000000"/>
-            </w:tcBorders>
-          </w:tcPr>
-          <w:p>
-            <w:pPr>
-              <w:pStyle w:val="TableContents"/>
-              <w:bidi w:val="0"/>
-              <w:jc w:val="left"/>
-              <w:rPr>
-                <w:rFonts w:ascii="Times New Roman" w:hAnsi="Times New Roman"/>
-                <w:sz w:val="24"/>
-                <w:szCs w:val="24"/>
-              </w:rPr>
-            </w:pPr>
-            <w:r>
-              <w:rPr>
-                <w:rFonts w:ascii="Times New Roman" w:hAnsi="Times New Roman"/>
-                <w:b/>
-                <w:bCs/>
-                <w:sz w:val="24"/>
-                <w:szCs w:val="24"/>
-              </w:rPr>
-              <w:t>AT ( )</w:t>
-            </w:r>
-          </w:p>
-          <w:p>
-            <w:pPr>
-              <w:pStyle w:val="TableContents"/>
-              <w:bidi w:val="0"/>
-              <w:jc w:val="left"/>
-              <w:rPr>
-                <w:rFonts w:ascii="Times New Roman" w:hAnsi="Times New Roman"/>
-                <w:sz w:val="24"/>
-                <w:szCs w:val="24"/>
-              </w:rPr>
-            </w:pPr>
-            <w:r>
-              <w:rPr>
-                <w:rFonts w:ascii="Times New Roman" w:hAnsi="Times New Roman"/>
-                <w:b/>
-                <w:bCs/>
-                <w:sz w:val="24"/>
-                <w:szCs w:val="24"/>
-              </w:rPr>
-              <w:t>AP ( )</w:t>
-            </w:r>
-          </w:p>
-        </w:tc>
-      </w:tr>
-      <w:tr>
-        <w:trPr>
-          <w:trHeight w:val="837" w:hRule="atLeast"/>
-        </w:trPr>
-        <w:tc>
-          <w:tcPr>
-            <w:tcW w:w="7483" w:type="dxa"/>
-            <w:tcBorders>
-              <w:left w:val="single" w:sz="2" w:space="0" w:color="000000"/>
-              <w:bottom w:val="single" w:sz="2" w:space="0" w:color="000000"/>
             </w:tcBorders>
           </w:tcPr>
           <w:p>
@@ -256,39 +194,6 @@
             </w:r>
           </w:p>
         </w:tc>
-        <w:tc>
-          <w:tcPr>
-            <w:tcW w:w="1562" w:type="dxa"/>
-            <w:tcBorders>
-              <w:left w:val="single" w:sz="2" w:space="0" w:color="000000"/>
-              <w:bottom w:val="single" w:sz="2" w:space="0" w:color="000000"/>
-              <w:right w:val="single" w:sz="2" w:space="0" w:color="000000"/>
-            </w:tcBorders>
-          </w:tcPr>
-          <w:p>
-            <w:pPr>
-              <w:pStyle w:val="TableContents"/>
-              <w:bidi w:val="0"/>
-              <w:jc w:val="left"/>
-              <w:rPr>
-                <w:rFonts w:ascii="Times New Roman" w:hAnsi="Times New Roman"/>
-                <w:b w:val="false"/>
-                <w:bCs w:val="false"/>
-                <w:sz w:val="24"/>
-                <w:szCs w:val="24"/>
-              </w:rPr>
-            </w:pPr>
-            <w:r>
-              <w:rPr>
-                <w:rFonts w:ascii="Times New Roman" w:hAnsi="Times New Roman"/>
-                <w:b w:val="false"/>
-                <w:bCs w:val="false"/>
-                <w:sz w:val="24"/>
-                <w:szCs w:val="24"/>
-              </w:rPr>
-            </w:r>
-          </w:p>
-        </w:tc>
       </w:tr>
       <w:tr>
         <w:trPr>
@@ -296,10 +201,12 @@
         </w:trPr>
         <w:tc>
           <w:tcPr>
-            <w:tcW w:w="7483" w:type="dxa"/>
-            <w:tcBorders>
-              <w:left w:val="single" w:sz="2" w:space="0" w:color="000000"/>
-              <w:bottom w:val="single" w:sz="2" w:space="0" w:color="000000"/>
+            <w:tcW w:w="8640" w:type="dxa"/>
+            <w:gridSpan w:val="2"/>
+            <w:tcBorders>
+              <w:left w:val="single" w:sz="2" w:space="0" w:color="000000"/>
+              <w:bottom w:val="single" w:sz="2" w:space="0" w:color="000000"/>
+              <w:right w:val="single" w:sz="2" w:space="0" w:color="000000"/>
             </w:tcBorders>
           </w:tcPr>
           <w:p>
@@ -332,39 +239,6 @@
             </w:r>
           </w:p>
         </w:tc>
-        <w:tc>
-          <w:tcPr>
-            <w:tcW w:w="1562" w:type="dxa"/>
-            <w:tcBorders>
-              <w:left w:val="single" w:sz="2" w:space="0" w:color="000000"/>
-              <w:bottom w:val="single" w:sz="2" w:space="0" w:color="000000"/>
-              <w:right w:val="single" w:sz="2" w:space="0" w:color="000000"/>
-            </w:tcBorders>
-          </w:tcPr>
-          <w:p>
-            <w:pPr>
-              <w:pStyle w:val="TableContents"/>
-              <w:bidi w:val="0"/>
-              <w:jc w:val="left"/>
-              <w:rPr>
-                <w:rFonts w:ascii="Times New Roman" w:hAnsi="Times New Roman"/>
-                <w:b w:val="false"/>
-                <w:bCs w:val="false"/>
-                <w:sz w:val="24"/>
-                <w:szCs w:val="24"/>
-              </w:rPr>
-            </w:pPr>
-            <w:r>
-              <w:rPr>
-                <w:rFonts w:ascii="Times New Roman" w:hAnsi="Times New Roman"/>
-                <w:b w:val="false"/>
-                <w:bCs w:val="false"/>
-                <w:sz w:val="24"/>
-                <w:szCs w:val="24"/>
-              </w:rPr>
-            </w:r>
-          </w:p>
-        </w:tc>
       </w:tr>
       <w:tr>
         <w:trPr>
@@ -372,10 +246,12 @@
         </w:trPr>
         <w:tc>
           <w:tcPr>
-            <w:tcW w:w="7483" w:type="dxa"/>
-            <w:tcBorders>
-              <w:left w:val="single" w:sz="2" w:space="0" w:color="000000"/>
-              <w:bottom w:val="single" w:sz="2" w:space="0" w:color="000000"/>
+            <w:tcW w:w="8640" w:type="dxa"/>
+            <w:gridSpan w:val="2"/>
+            <w:tcBorders>
+              <w:left w:val="single" w:sz="2" w:space="0" w:color="000000"/>
+              <w:bottom w:val="single" w:sz="2" w:space="0" w:color="000000"/>
+              <w:right w:val="single" w:sz="2" w:space="0" w:color="000000"/>
             </w:tcBorders>
           </w:tcPr>
           <w:p>
@@ -407,41 +283,30 @@
             </w:r>
           </w:p>
         </w:tc>
-        <w:tc>
-          <w:tcPr>
-            <w:tcW w:w="1562" w:type="dxa"/>
-            <w:tcBorders>
-              <w:left w:val="single" w:sz="2" w:space="0" w:color="000000"/>
-              <w:bottom w:val="single" w:sz="2" w:space="0" w:color="000000"/>
-              <w:right w:val="single" w:sz="2" w:space="0" w:color="000000"/>
-            </w:tcBorders>
-          </w:tcPr>
-          <w:p>
-            <w:pPr>
-              <w:pStyle w:val="TableContents"/>
-              <w:bidi w:val="0"/>
-              <w:jc w:val="left"/>
-              <w:rPr>
-                <w:rFonts w:ascii="Times New Roman" w:hAnsi="Times New Roman"/>
-                <w:b w:val="false"/>
-                <w:bCs w:val="false"/>
-                <w:sz w:val="24"/>
-                <w:szCs w:val="24"/>
-              </w:rPr>
-            </w:pPr>
-            <w:r>
-              <w:rPr>
-                <w:rFonts w:ascii="Times New Roman" w:hAnsi="Times New Roman"/>
-                <w:b w:val="false"/>
-                <w:bCs w:val="false"/>
-                <w:sz w:val="24"/>
-                <w:szCs w:val="24"/>
-              </w:rPr>
-            </w:r>
-          </w:p>
-        </w:tc>
       </w:tr>
     </w:tbl>
+    <w:p>
+      <w:pPr>
+        <w:pStyle w:val="Normal"/>
+        <w:bidi w:val="0"/>
+        <w:jc w:val="left"/>
+        <w:rPr/>
+      </w:pPr>
+      <w:r>
+        <w:rPr/>
+      </w:r>
+    </w:p>
+    <w:p>
+      <w:pPr>
+        <w:pStyle w:val="Normal"/>
+        <w:bidi w:val="0"/>
+        <w:jc w:val="left"/>
+        <w:rPr/>
+      </w:pPr>
+      <w:r>
+        <w:rPr/>
+      </w:r>
+    </w:p>
     <w:p>
       <w:pPr>
         <w:pStyle w:val="Normal"/>
@@ -503,6 +368,13 @@
       <w:lang w:val="pt-BR" w:eastAsia="zh-CN" w:bidi="hi-IN"/>
     </w:rPr>
   </w:style>
+  <w:style w:type="character" w:styleId="Bullets">
+    <w:name w:val="Bullets"/>
+    <w:qFormat/>
+    <w:rPr>
+      <w:rFonts w:ascii="OpenSymbol" w:hAnsi="OpenSymbol" w:eastAsia="OpenSymbol" w:cs="OpenSymbol"/>
+    </w:rPr>
+  </w:style>
   <w:style w:type="paragraph" w:styleId="Heading">
     <w:name w:val="Heading"/>
     <w:basedOn w:val="Normal"/>
@@ -569,7 +441,22 @@
       <w:widowControl w:val="false"/>
       <w:suppressLineNumbers/>
     </w:pPr>
-    <w:rPr/>
+    <w:rPr>
+      <w:b/>
+    </w:rPr>
+  </w:style>
+  <w:style w:type="paragraph" w:styleId="TableHeading">
+    <w:name w:val="Table Heading"/>
+    <w:basedOn w:val="TableContents"/>
+    <w:qFormat/>
+    <w:pPr>
+      <w:suppressLineNumbers/>
+      <w:jc w:val="center"/>
+    </w:pPr>
+    <w:rPr>
+      <w:b/>
+      <w:bCs/>
+    </w:rPr>
   </w:style>
 </w:styles>
 </file>

</xml_diff>